<commit_message>
Update scientific report content with simplified explanations, separate Case 1 & Case 2, and remove scenario overview table
</commit_message>
<xml_diff>
--- a/backend/training/results/BAO_CAO_CHI_TIET_KET_QUA_THUC_NGHIEM.docx
+++ b/backend/training/results/BAO_CAO_CHI_TIET_KET_QUA_THUC_NGHIEM.docx
@@ -8,7 +8,7 @@
         <w:spacing w:before="240" w:after="240"/>
       </w:pPr>
       <w:r>
-        <w:t>4.3. Kết quả thực nghiệm và Thảo luận (Experimental Results and Discussion)</w:t>
+        <w:t>4.3. Kết quả thực nghiệm và Thảo luận (Experimental Results)</w:t>
       </w:r>
     </w:p>
     <w:p>
@@ -16,34 +16,7 @@
         <w:spacing w:after="120" w:line="276" w:lineRule="auto"/>
       </w:pPr>
       <w:r>
-        <w:t>Để đánh giá toàn diện hiệu năng và độ ổn định của hệ thống nhận diện khuôn mặt trong các kịch bản vận hành thực tế, thực nghiệm được tiến hành trên 03 bộ dữ liệu thành phần:</w:t>
-      </w:r>
-    </w:p>
-    <w:p>
-      <w:pPr>
-        <w:pStyle w:val="ListBullet"/>
-        <w:spacing w:after="60" w:line="276" w:lineRule="auto"/>
-      </w:pPr>
-      <w:r>
-        <w:t>Bộ dữ liệu 39 sinh viên thật (thu thập thực tế): Sử dụng ảnh đăng ký gốc (Enroll) làm thư viện ảnh chuẩn (Gallery) và ảnh webcam từ lớp học thực tế để làm tập kiểm thử (Query).</w:t>
-      </w:r>
-    </w:p>
-    <w:p>
-      <w:pPr>
-        <w:pStyle w:val="ListBullet"/>
-        <w:spacing w:after="60" w:line="276" w:lineRule="auto"/>
-      </w:pPr>
-      <w:r>
-        <w:t>Bộ dữ liệu người lạ (Strangers Dataset): Gồm các ảnh khuôn mặt người lạ hoàn toàn không có trong danh sách đăng ký của hệ thống, dùng để thử nghiệm tính năng lọc người lạ.</w:t>
-      </w:r>
-    </w:p>
-    <w:p>
-      <w:pPr>
-        <w:pStyle w:val="ListBullet"/>
-        <w:spacing w:after="60" w:line="276" w:lineRule="auto"/>
-      </w:pPr>
-      <w:r>
-        <w:t>Tập dữ liệu giả lập quy mô lớn (Synthetic Embeddings Dataset): Gồm 16.000 bộ vector đặc trưng giả lập có cấu trúc tương đương đặc trưng ArcFace để benchmark khả năng mở rộng và độ trễ ở quy mô lớn.</w:t>
+        <w:t>Để đánh giá khả năng nhận diện và độ ổn định thực tế của hệ thống, chúng tôi tiến hành thực nghiệm và đối chiếu hiệu năng qua 5 thử nghiệm cụ thể dưới đây. Dữ liệu thử nghiệm bao gồm ảnh thực tế của 39 sinh viên đi học, ảnh người lạ thu thập trên mạng, và bộ dữ liệu giả lập 16.000 người để thử nghiệm giới hạn tốc độ.</w:t>
       </w:r>
     </w:p>
     <w:p>
@@ -51,7 +24,7 @@
         <w:pStyle w:val="Heading2"/>
       </w:pPr>
       <w:r>
-        <w:t>4.3.1. Các độ đo đánh giá hiệu năng và thiết kế kịch bản</w:t>
+        <w:t>4.3.1. Các chỉ số đánh giá hiệu năng</w:t>
       </w:r>
     </w:p>
     <w:p>
@@ -59,7 +32,7 @@
         <w:spacing w:after="120" w:line="276" w:lineRule="auto"/>
       </w:pPr>
       <w:r>
-        <w:t>Hiệu năng tổng thể của hệ thống được định lượng khoa học thông qua 07 chỉ số đánh giá tiêu chuẩn sau:</w:t>
+        <w:t>Chất lượng của hệ thống được đo lường cụ thể thông qua 07 chỉ số chính sau đây:</w:t>
       </w:r>
     </w:p>
     <w:tbl>
@@ -126,7 +99,7 @@
                 <w:color w:val="FFFFFF"/>
                 <w:sz w:val="20"/>
               </w:rPr>
-              <w:t>Độ đo đánh giá</w:t>
+              <w:t>Đo độ đo</w:t>
             </w:r>
           </w:p>
         </w:tc>
@@ -152,7 +125,7 @@
                 <w:color w:val="FFFFFF"/>
                 <w:sz w:val="20"/>
               </w:rPr>
-              <w:t>Mô tả chi tiết ý nghĩa khoa học</w:t>
+              <w:t>Mô tả ý nghĩa và tác dụng</w:t>
             </w:r>
           </w:p>
         </w:tc>
@@ -204,7 +177,7 @@
                 <w:color w:val="FFFFFF"/>
                 <w:sz w:val="20"/>
               </w:rPr>
-              <w:t>Kỳ vọng đích</w:t>
+              <w:t>Kỳ vọng hệ thống</w:t>
             </w:r>
           </w:p>
         </w:tc>
@@ -275,7 +248,7 @@
               <w:rPr>
                 <w:sz w:val="20"/>
               </w:rPr>
-              <w:t>Tỷ lệ phân loại chính xác trên toàn bộ tập ảnh kiểm thử đã đăng ký.</w:t>
+              <w:t>Tỷ lệ nhận diện đúng danh tính trên tổng số ảnh sinh viên có trong hệ thống.</w:t>
             </w:r>
           </w:p>
         </w:tc>
@@ -321,7 +294,7 @@
               <w:rPr>
                 <w:sz w:val="20"/>
               </w:rPr>
-              <w:t>Tối đa hóa</w:t>
+              <w:t>Càng cao càng tốt</w:t>
             </w:r>
           </w:p>
         </w:tc>
@@ -369,7 +342,7 @@
               <w:rPr>
                 <w:sz w:val="20"/>
               </w:rPr>
-              <w:t>Precision (Độ chính xác tích cực)</w:t>
+              <w:t>Precision (Độ chuẩn xác)</w:t>
             </w:r>
           </w:p>
         </w:tc>
@@ -392,7 +365,7 @@
               <w:rPr>
                 <w:sz w:val="20"/>
               </w:rPr>
-              <w:t>Khả năng tránh nhận diện nhầm sinh viên này thành sinh viên khác trong Gallery.</w:t>
+              <w:t>Trong những lần hệ thống báo nhận ra sinh viên, có bao nhiêu phần trăm là đúng.</w:t>
             </w:r>
           </w:p>
         </w:tc>
@@ -438,7 +411,7 @@
               <w:rPr>
                 <w:sz w:val="20"/>
               </w:rPr>
-              <w:t>Tối đa hóa</w:t>
+              <w:t>Càng cao càng tốt</w:t>
             </w:r>
           </w:p>
         </w:tc>
@@ -509,7 +482,7 @@
               <w:rPr>
                 <w:sz w:val="20"/>
               </w:rPr>
-              <w:t>Tỷ lệ nhận diện thành công sinh viên trên tổng số sinh viên thực tế đi qua thiết bị.</w:t>
+              <w:t>Tỷ lệ sinh viên được ghi nhận thành công trên tổng số sinh viên thực tế đứng trước camera.</w:t>
             </w:r>
           </w:p>
         </w:tc>
@@ -555,7 +528,7 @@
               <w:rPr>
                 <w:sz w:val="20"/>
               </w:rPr>
-              <w:t>Tối đa hóa</w:t>
+              <w:t>Càng cao càng tốt</w:t>
             </w:r>
           </w:p>
         </w:tc>
@@ -603,7 +576,7 @@
               <w:rPr>
                 <w:sz w:val="20"/>
               </w:rPr>
-              <w:t>F1-Score (Điểm F1)</w:t>
+              <w:t>F1-Score (Chỉ số F1)</w:t>
             </w:r>
           </w:p>
         </w:tc>
@@ -626,7 +599,7 @@
               <w:rPr>
                 <w:sz w:val="20"/>
               </w:rPr>
-              <w:t>Giá trị trung bình điều hòa của Precision và Recall, đại diện cho độ tin cậy tổng thể.</w:t>
+              <w:t>Điểm đánh giá cân bằng tổng hợp giữa độ chuẩn xác (Precision) và độ nhạy (Recall).</w:t>
             </w:r>
           </w:p>
         </w:tc>
@@ -672,7 +645,7 @@
               <w:rPr>
                 <w:sz w:val="20"/>
               </w:rPr>
-              <w:t>Tối đa hóa</w:t>
+              <w:t>Càng cao càng tốt</w:t>
             </w:r>
           </w:p>
         </w:tc>
@@ -743,7 +716,7 @@
               <w:rPr>
                 <w:sz w:val="20"/>
               </w:rPr>
-              <w:t>Cosine Similarity trung bình đo được giữa vector truy vấn và vector khớp nhất trong Gallery.</w:t>
+              <w:t>Điểm số khớp nhau trung bình giữa khuôn mặt camera quét được với ảnh thẻ gốc (từ 0 đến 1).</w:t>
             </w:r>
           </w:p>
         </w:tc>
@@ -789,7 +762,7 @@
               <w:rPr>
                 <w:sz w:val="20"/>
               </w:rPr>
-              <w:t>Tối đa hóa</w:t>
+              <w:t>Càng cao càng tốt</w:t>
             </w:r>
           </w:p>
         </w:tc>
@@ -860,7 +833,7 @@
               <w:rPr>
                 <w:sz w:val="20"/>
               </w:rPr>
-              <w:t>Tỷ lệ từ chối chính xác các mẫu thử nghiệm thuộc tập người lạ (Impostor Probe).</w:t>
+              <w:t>Tỷ lệ từ chối thành công người ngoài (người lạ không có tên trong danh sách).</w:t>
             </w:r>
           </w:p>
         </w:tc>
@@ -906,7 +879,7 @@
               <w:rPr>
                 <w:sz w:val="20"/>
               </w:rPr>
-              <w:t>Tối đa hóa</w:t>
+              <w:t>Càng cao càng tốt</w:t>
             </w:r>
           </w:p>
         </w:tc>
@@ -977,7 +950,7 @@
               <w:rPr>
                 <w:sz w:val="20"/>
               </w:rPr>
-              <w:t>Thời gian thực thi trung bình của riêng bước so khớp đặc trưng tại Classifier Head.</w:t>
+              <w:t>Thời gian hệ thống tìm kiếm và đối chiếu khuôn mặt (không tính thời gian phát hiện mặt).</w:t>
             </w:r>
           </w:p>
         </w:tc>
@@ -1023,753 +996,7 @@
               <w:rPr>
                 <w:sz w:val="20"/>
               </w:rPr>
-              <w:t>Tối thiểu hóa</w:t>
-            </w:r>
-          </w:p>
-        </w:tc>
-      </w:tr>
-    </w:tbl>
-    <w:p>
-      <w:pPr>
-        <w:spacing w:after="120"/>
-      </w:pPr>
-    </w:p>
-    <w:p>
-      <w:pPr>
-        <w:spacing w:after="120" w:line="276" w:lineRule="auto"/>
-      </w:pPr>
-      <w:r>
-        <w:t>Để kiểm chứng từng khía cạnh chức năng độc lập của mô hình, thực nghiệm được cấu trúc làm 05 case nghiên cứu như sau:</w:t>
-      </w:r>
-    </w:p>
-    <w:tbl>
-      <w:tblPr>
-        <w:tblStyle w:val="TableGrid"/>
-        <w:tblW w:type="auto" w:w="0"/>
-        <w:jc w:val="center"/>
-        <w:tblLayout w:type="fixed"/>
-        <w:tblLook w:firstColumn="1" w:firstRow="1" w:lastColumn="0" w:lastRow="0" w:noHBand="0" w:noVBand="1" w:val="04A0"/>
-      </w:tblPr>
-      <w:tblGrid>
-        <w:gridCol w:w="1881"/>
-        <w:gridCol w:w="1881"/>
-        <w:gridCol w:w="1881"/>
-        <w:gridCol w:w="1881"/>
-        <w:gridCol w:w="1881"/>
-      </w:tblGrid>
-      <w:tr>
-        <w:tc>
-          <w:tcPr>
-            <w:tcW w:type="dxa" w:w="680"/>
-            <w:shd w:fill="1F4E79"/>
-            <w:tcMar>
-              <w:top w:w="120" w:type="dxa"/>
-              <w:bottom w:w="120" w:type="dxa"/>
-              <w:left w:w="150" w:type="dxa"/>
-              <w:right w:w="150" w:type="dxa"/>
-            </w:tcMar>
-            <w:vAlign w:val="center"/>
-          </w:tcPr>
-          <w:p>
-            <w:pPr>
-              <w:jc w:val="center"/>
-            </w:pPr>
-            <w:r>
-              <w:rPr>
-                <w:b/>
-                <w:color w:val="FFFFFF"/>
-                <w:sz w:val="20"/>
-              </w:rPr>
-              <w:t>Case</w:t>
-            </w:r>
-          </w:p>
-        </w:tc>
-        <w:tc>
-          <w:tcPr>
-            <w:tcW w:type="dxa" w:w="1701"/>
-            <w:shd w:fill="1F4E79"/>
-            <w:tcMar>
-              <w:top w:w="120" w:type="dxa"/>
-              <w:bottom w:w="120" w:type="dxa"/>
-              <w:left w:w="150" w:type="dxa"/>
-              <w:right w:w="150" w:type="dxa"/>
-            </w:tcMar>
-            <w:vAlign w:val="center"/>
-          </w:tcPr>
-          <w:p>
-            <w:pPr>
-              <w:jc w:val="center"/>
-            </w:pPr>
-            <w:r>
-              <w:rPr>
-                <w:b/>
-                <w:color w:val="FFFFFF"/>
-                <w:sz w:val="20"/>
-              </w:rPr>
-              <w:t>Trạng thái hệ thống</w:t>
-            </w:r>
-          </w:p>
-        </w:tc>
-        <w:tc>
-          <w:tcPr>
-            <w:tcW w:type="dxa" w:w="1701"/>
-            <w:shd w:fill="1F4E79"/>
-            <w:tcMar>
-              <w:top w:w="120" w:type="dxa"/>
-              <w:bottom w:w="120" w:type="dxa"/>
-              <w:left w:w="150" w:type="dxa"/>
-              <w:right w:w="150" w:type="dxa"/>
-            </w:tcMar>
-            <w:vAlign w:val="center"/>
-          </w:tcPr>
-          <w:p>
-            <w:pPr>
-              <w:jc w:val="center"/>
-            </w:pPr>
-            <w:r>
-              <w:rPr>
-                <w:b/>
-                <w:color w:val="FFFFFF"/>
-                <w:sz w:val="20"/>
-              </w:rPr>
-              <w:t>Bộ dữ liệu sử dụng</w:t>
-            </w:r>
-          </w:p>
-        </w:tc>
-        <w:tc>
-          <w:tcPr>
-            <w:tcW w:type="dxa" w:w="3969"/>
-            <w:shd w:fill="1F4E79"/>
-            <w:tcMar>
-              <w:top w:w="120" w:type="dxa"/>
-              <w:bottom w:w="120" w:type="dxa"/>
-              <w:left w:w="150" w:type="dxa"/>
-              <w:right w:w="150" w:type="dxa"/>
-            </w:tcMar>
-            <w:vAlign w:val="center"/>
-          </w:tcPr>
-          <w:p>
-            <w:pPr>
-              <w:jc w:val="center"/>
-            </w:pPr>
-            <w:r>
-              <w:rPr>
-                <w:b/>
-                <w:color w:val="FFFFFF"/>
-                <w:sz w:val="20"/>
-              </w:rPr>
-              <w:t>Mục tiêu khoa học chính</w:t>
-            </w:r>
-          </w:p>
-        </w:tc>
-        <w:tc>
-          <w:tcPr>
-            <w:tcW w:type="dxa" w:w="1701"/>
-            <w:shd w:fill="1F4E79"/>
-            <w:tcMar>
-              <w:top w:w="120" w:type="dxa"/>
-              <w:bottom w:w="120" w:type="dxa"/>
-              <w:left w:w="150" w:type="dxa"/>
-              <w:right w:w="150" w:type="dxa"/>
-            </w:tcMar>
-            <w:vAlign w:val="center"/>
-          </w:tcPr>
-          <w:p>
-            <w:pPr>
-              <w:jc w:val="center"/>
-            </w:pPr>
-            <w:r>
-              <w:rPr>
-                <w:b/>
-                <w:color w:val="FFFFFF"/>
-                <w:sz w:val="20"/>
-              </w:rPr>
-              <w:t>Thuật toán đối chiếu</w:t>
-            </w:r>
-          </w:p>
-        </w:tc>
-      </w:tr>
-      <w:tr>
-        <w:tc>
-          <w:tcPr>
-            <w:tcW w:type="dxa" w:w="680"/>
-            <w:tcMar>
-              <w:top w:w="100" w:type="dxa"/>
-              <w:bottom w:w="100" w:type="dxa"/>
-              <w:left w:w="150" w:type="dxa"/>
-              <w:right w:w="150" w:type="dxa"/>
-            </w:tcMar>
-            <w:vAlign w:val="center"/>
-          </w:tcPr>
-          <w:p>
-            <w:pPr>
-              <w:jc w:val="center"/>
-            </w:pPr>
-            <w:r>
-              <w:rPr>
-                <w:sz w:val="20"/>
-              </w:rPr>
-              <w:t>1</w:t>
-            </w:r>
-          </w:p>
-        </w:tc>
-        <w:tc>
-          <w:tcPr>
-            <w:tcW w:type="dxa" w:w="1701"/>
-            <w:tcMar>
-              <w:top w:w="100" w:type="dxa"/>
-              <w:bottom w:w="100" w:type="dxa"/>
-              <w:left w:w="150" w:type="dxa"/>
-              <w:right w:w="150" w:type="dxa"/>
-            </w:tcMar>
-            <w:vAlign w:val="center"/>
-          </w:tcPr>
-          <w:p>
-            <w:pPr>
-              <w:jc w:val="left"/>
-            </w:pPr>
-            <w:r>
-              <w:rPr>
-                <w:sz w:val="20"/>
-              </w:rPr>
-              <w:t>Fine-tune ResNet-18</w:t>
-            </w:r>
-          </w:p>
-        </w:tc>
-        <w:tc>
-          <w:tcPr>
-            <w:tcW w:type="dxa" w:w="1701"/>
-            <w:tcMar>
-              <w:top w:w="100" w:type="dxa"/>
-              <w:bottom w:w="100" w:type="dxa"/>
-              <w:left w:w="150" w:type="dxa"/>
-              <w:right w:w="150" w:type="dxa"/>
-            </w:tcMar>
-            <w:vAlign w:val="center"/>
-          </w:tcPr>
-          <w:p>
-            <w:pPr>
-              <w:jc w:val="left"/>
-            </w:pPr>
-            <w:r>
-              <w:rPr>
-                <w:sz w:val="20"/>
-              </w:rPr>
-              <w:t>39 sinh viên thực tế</w:t>
-            </w:r>
-          </w:p>
-        </w:tc>
-        <w:tc>
-          <w:tcPr>
-            <w:tcW w:type="dxa" w:w="3969"/>
-            <w:tcMar>
-              <w:top w:w="100" w:type="dxa"/>
-              <w:bottom w:w="100" w:type="dxa"/>
-              <w:left w:w="150" w:type="dxa"/>
-              <w:right w:w="150" w:type="dxa"/>
-            </w:tcMar>
-            <w:vAlign w:val="center"/>
-          </w:tcPr>
-          <w:p>
-            <w:pPr>
-              <w:jc w:val="center"/>
-            </w:pPr>
-            <w:r>
-              <w:rPr>
-                <w:sz w:val="20"/>
-              </w:rPr>
-              <w:t>Khảo sát hiện tượng quá khớp (Overfitting) và sự trôi lệch miền đặc trưng trong bài toán ít mẫu (Few-shot learning).</w:t>
-            </w:r>
-          </w:p>
-        </w:tc>
-        <w:tc>
-          <w:tcPr>
-            <w:tcW w:type="dxa" w:w="1701"/>
-            <w:tcMar>
-              <w:top w:w="100" w:type="dxa"/>
-              <w:bottom w:w="100" w:type="dxa"/>
-              <w:left w:w="150" w:type="dxa"/>
-              <w:right w:w="150" w:type="dxa"/>
-            </w:tcMar>
-            <w:vAlign w:val="center"/>
-          </w:tcPr>
-          <w:p>
-            <w:pPr>
-              <w:jc w:val="center"/>
-            </w:pPr>
-            <w:r>
-              <w:rPr>
-                <w:sz w:val="20"/>
-              </w:rPr>
-              <w:t>FAISS Flat, HNSW</w:t>
-            </w:r>
-          </w:p>
-        </w:tc>
-      </w:tr>
-      <w:tr>
-        <w:tc>
-          <w:tcPr>
-            <w:tcW w:type="dxa" w:w="680"/>
-            <w:tcMar>
-              <w:top w:w="100" w:type="dxa"/>
-              <w:bottom w:w="100" w:type="dxa"/>
-              <w:left w:w="150" w:type="dxa"/>
-              <w:right w:w="150" w:type="dxa"/>
-            </w:tcMar>
-            <w:vAlign w:val="center"/>
-          </w:tcPr>
-          <w:p>
-            <w:pPr>
-              <w:jc w:val="center"/>
-            </w:pPr>
-            <w:r>
-              <w:rPr>
-                <w:sz w:val="20"/>
-              </w:rPr>
-              <w:t>2</w:t>
-            </w:r>
-          </w:p>
-        </w:tc>
-        <w:tc>
-          <w:tcPr>
-            <w:tcW w:type="dxa" w:w="1701"/>
-            <w:tcMar>
-              <w:top w:w="100" w:type="dxa"/>
-              <w:bottom w:w="100" w:type="dxa"/>
-              <w:left w:w="150" w:type="dxa"/>
-              <w:right w:w="150" w:type="dxa"/>
-            </w:tcMar>
-            <w:vAlign w:val="center"/>
-          </w:tcPr>
-          <w:p>
-            <w:pPr>
-              <w:jc w:val="left"/>
-            </w:pPr>
-            <w:r>
-              <w:rPr>
-                <w:sz w:val="20"/>
-              </w:rPr>
-              <w:t>ArcFace Pretrained</w:t>
-            </w:r>
-          </w:p>
-        </w:tc>
-        <w:tc>
-          <w:tcPr>
-            <w:tcW w:type="dxa" w:w="1701"/>
-            <w:tcMar>
-              <w:top w:w="100" w:type="dxa"/>
-              <w:bottom w:w="100" w:type="dxa"/>
-              <w:left w:w="150" w:type="dxa"/>
-              <w:right w:w="150" w:type="dxa"/>
-            </w:tcMar>
-            <w:vAlign w:val="center"/>
-          </w:tcPr>
-          <w:p>
-            <w:pPr>
-              <w:jc w:val="left"/>
-            </w:pPr>
-            <w:r>
-              <w:rPr>
-                <w:sz w:val="20"/>
-              </w:rPr>
-              <w:t>39 sinh viên thực tế</w:t>
-            </w:r>
-          </w:p>
-        </w:tc>
-        <w:tc>
-          <w:tcPr>
-            <w:tcW w:type="dxa" w:w="3969"/>
-            <w:tcMar>
-              <w:top w:w="100" w:type="dxa"/>
-              <w:bottom w:w="100" w:type="dxa"/>
-              <w:left w:w="150" w:type="dxa"/>
-              <w:right w:w="150" w:type="dxa"/>
-            </w:tcMar>
-            <w:vAlign w:val="center"/>
-          </w:tcPr>
-          <w:p>
-            <w:pPr>
-              <w:jc w:val="center"/>
-            </w:pPr>
-            <w:r>
-              <w:rPr>
-                <w:sz w:val="20"/>
-              </w:rPr>
-              <w:t>Đánh giá độ chính xác nhận diện trên ảnh thực địa lớp học của mô hình pretrained chuẩn.</w:t>
-            </w:r>
-          </w:p>
-        </w:tc>
-        <w:tc>
-          <w:tcPr>
-            <w:tcW w:type="dxa" w:w="1701"/>
-            <w:tcMar>
-              <w:top w:w="100" w:type="dxa"/>
-              <w:bottom w:w="100" w:type="dxa"/>
-              <w:left w:w="150" w:type="dxa"/>
-              <w:right w:w="150" w:type="dxa"/>
-            </w:tcMar>
-            <w:vAlign w:val="center"/>
-          </w:tcPr>
-          <w:p>
-            <w:pPr>
-              <w:jc w:val="center"/>
-            </w:pPr>
-            <w:r>
-              <w:rPr>
-                <w:sz w:val="20"/>
-              </w:rPr>
-              <w:t>FAISS Flat, HNSW</w:t>
-            </w:r>
-          </w:p>
-        </w:tc>
-      </w:tr>
-      <w:tr>
-        <w:tc>
-          <w:tcPr>
-            <w:tcW w:type="dxa" w:w="680"/>
-            <w:tcMar>
-              <w:top w:w="100" w:type="dxa"/>
-              <w:bottom w:w="100" w:type="dxa"/>
-              <w:left w:w="150" w:type="dxa"/>
-              <w:right w:w="150" w:type="dxa"/>
-            </w:tcMar>
-            <w:vAlign w:val="center"/>
-          </w:tcPr>
-          <w:p>
-            <w:pPr>
-              <w:jc w:val="center"/>
-            </w:pPr>
-            <w:r>
-              <w:rPr>
-                <w:sz w:val="20"/>
-              </w:rPr>
-              <w:t>3</w:t>
-            </w:r>
-          </w:p>
-        </w:tc>
-        <w:tc>
-          <w:tcPr>
-            <w:tcW w:type="dxa" w:w="1701"/>
-            <w:tcMar>
-              <w:top w:w="100" w:type="dxa"/>
-              <w:bottom w:w="100" w:type="dxa"/>
-              <w:left w:w="150" w:type="dxa"/>
-              <w:right w:w="150" w:type="dxa"/>
-            </w:tcMar>
-            <w:vAlign w:val="center"/>
-          </w:tcPr>
-          <w:p>
-            <w:pPr>
-              <w:jc w:val="left"/>
-            </w:pPr>
-            <w:r>
-              <w:rPr>
-                <w:sz w:val="20"/>
-              </w:rPr>
-              <w:t>ArcFace Pretrained</w:t>
-            </w:r>
-          </w:p>
-        </w:tc>
-        <w:tc>
-          <w:tcPr>
-            <w:tcW w:type="dxa" w:w="1701"/>
-            <w:tcMar>
-              <w:top w:w="100" w:type="dxa"/>
-              <w:bottom w:w="100" w:type="dxa"/>
-              <w:left w:w="150" w:type="dxa"/>
-              <w:right w:w="150" w:type="dxa"/>
-            </w:tcMar>
-            <w:vAlign w:val="center"/>
-          </w:tcPr>
-          <w:p>
-            <w:pPr>
-              <w:jc w:val="left"/>
-            </w:pPr>
-            <w:r>
-              <w:rPr>
-                <w:sz w:val="20"/>
-              </w:rPr>
-              <w:t>16.000 SV giả lập</w:t>
-            </w:r>
-          </w:p>
-        </w:tc>
-        <w:tc>
-          <w:tcPr>
-            <w:tcW w:type="dxa" w:w="3969"/>
-            <w:tcMar>
-              <w:top w:w="100" w:type="dxa"/>
-              <w:bottom w:w="100" w:type="dxa"/>
-              <w:left w:w="150" w:type="dxa"/>
-              <w:right w:w="150" w:type="dxa"/>
-            </w:tcMar>
-            <w:vAlign w:val="center"/>
-          </w:tcPr>
-          <w:p>
-            <w:pPr>
-              <w:jc w:val="center"/>
-            </w:pPr>
-            <w:r>
-              <w:rPr>
-                <w:sz w:val="20"/>
-              </w:rPr>
-              <w:t>Đánh giá độ trễ và tính mở rộng (Scalability) của thuật toán tìm kiếm khi số lượng vector tăng lên mức quy mô lớn.</w:t>
-            </w:r>
-          </w:p>
-        </w:tc>
-        <w:tc>
-          <w:tcPr>
-            <w:tcW w:type="dxa" w:w="1701"/>
-            <w:tcMar>
-              <w:top w:w="100" w:type="dxa"/>
-              <w:bottom w:w="100" w:type="dxa"/>
-              <w:left w:w="150" w:type="dxa"/>
-              <w:right w:w="150" w:type="dxa"/>
-            </w:tcMar>
-            <w:vAlign w:val="center"/>
-          </w:tcPr>
-          <w:p>
-            <w:pPr>
-              <w:jc w:val="center"/>
-            </w:pPr>
-            <w:r>
-              <w:rPr>
-                <w:sz w:val="20"/>
-              </w:rPr>
-              <w:t>FAISS Flat, HNSW</w:t>
-            </w:r>
-          </w:p>
-        </w:tc>
-      </w:tr>
-      <w:tr>
-        <w:tc>
-          <w:tcPr>
-            <w:tcW w:type="dxa" w:w="680"/>
-            <w:tcMar>
-              <w:top w:w="100" w:type="dxa"/>
-              <w:bottom w:w="100" w:type="dxa"/>
-              <w:left w:w="150" w:type="dxa"/>
-              <w:right w:w="150" w:type="dxa"/>
-            </w:tcMar>
-            <w:vAlign w:val="center"/>
-          </w:tcPr>
-          <w:p>
-            <w:pPr>
-              <w:jc w:val="center"/>
-            </w:pPr>
-            <w:r>
-              <w:rPr>
-                <w:sz w:val="20"/>
-              </w:rPr>
-              <w:t>4</w:t>
-            </w:r>
-          </w:p>
-        </w:tc>
-        <w:tc>
-          <w:tcPr>
-            <w:tcW w:type="dxa" w:w="1701"/>
-            <w:tcMar>
-              <w:top w:w="100" w:type="dxa"/>
-              <w:bottom w:w="100" w:type="dxa"/>
-              <w:left w:w="150" w:type="dxa"/>
-              <w:right w:w="150" w:type="dxa"/>
-            </w:tcMar>
-            <w:vAlign w:val="center"/>
-          </w:tcPr>
-          <w:p>
-            <w:pPr>
-              <w:jc w:val="left"/>
-            </w:pPr>
-            <w:r>
-              <w:rPr>
-                <w:sz w:val="20"/>
-              </w:rPr>
-              <w:t>ArcFace Pretrained</w:t>
-            </w:r>
-          </w:p>
-        </w:tc>
-        <w:tc>
-          <w:tcPr>
-            <w:tcW w:type="dxa" w:w="1701"/>
-            <w:tcMar>
-              <w:top w:w="100" w:type="dxa"/>
-              <w:bottom w:w="100" w:type="dxa"/>
-              <w:left w:w="150" w:type="dxa"/>
-              <w:right w:w="150" w:type="dxa"/>
-            </w:tcMar>
-            <w:vAlign w:val="center"/>
-          </w:tcPr>
-          <w:p>
-            <w:pPr>
-              <w:jc w:val="left"/>
-            </w:pPr>
-            <w:r>
-              <w:rPr>
-                <w:sz w:val="20"/>
-              </w:rPr>
-              <w:t>Ảnh mạng người lạ</w:t>
-            </w:r>
-          </w:p>
-        </w:tc>
-        <w:tc>
-          <w:tcPr>
-            <w:tcW w:type="dxa" w:w="3969"/>
-            <w:tcMar>
-              <w:top w:w="100" w:type="dxa"/>
-              <w:bottom w:w="100" w:type="dxa"/>
-              <w:left w:w="150" w:type="dxa"/>
-              <w:right w:w="150" w:type="dxa"/>
-            </w:tcMar>
-            <w:vAlign w:val="center"/>
-          </w:tcPr>
-          <w:p>
-            <w:pPr>
-              <w:jc w:val="center"/>
-            </w:pPr>
-            <w:r>
-              <w:rPr>
-                <w:sz w:val="20"/>
-              </w:rPr>
-              <w:t>Đánh giá tính an toàn bảo mật, khả năng từ chối chính xác các tác nhân xâm nhập ngoài hệ thống.</w:t>
-            </w:r>
-          </w:p>
-        </w:tc>
-        <w:tc>
-          <w:tcPr>
-            <w:tcW w:type="dxa" w:w="1701"/>
-            <w:tcMar>
-              <w:top w:w="100" w:type="dxa"/>
-              <w:bottom w:w="100" w:type="dxa"/>
-              <w:left w:w="150" w:type="dxa"/>
-              <w:right w:w="150" w:type="dxa"/>
-            </w:tcMar>
-            <w:vAlign w:val="center"/>
-          </w:tcPr>
-          <w:p>
-            <w:pPr>
-              <w:jc w:val="center"/>
-            </w:pPr>
-            <w:r>
-              <w:rPr>
-                <w:sz w:val="20"/>
-              </w:rPr>
-              <w:t>FAISS Flat, HNSW</w:t>
-            </w:r>
-          </w:p>
-        </w:tc>
-      </w:tr>
-      <w:tr>
-        <w:tc>
-          <w:tcPr>
-            <w:tcW w:type="dxa" w:w="680"/>
-            <w:tcMar>
-              <w:top w:w="100" w:type="dxa"/>
-              <w:bottom w:w="100" w:type="dxa"/>
-              <w:left w:w="150" w:type="dxa"/>
-              <w:right w:w="150" w:type="dxa"/>
-            </w:tcMar>
-            <w:vAlign w:val="center"/>
-          </w:tcPr>
-          <w:p>
-            <w:pPr>
-              <w:jc w:val="center"/>
-            </w:pPr>
-            <w:r>
-              <w:rPr>
-                <w:sz w:val="20"/>
-              </w:rPr>
-              <w:t>5</w:t>
-            </w:r>
-          </w:p>
-        </w:tc>
-        <w:tc>
-          <w:tcPr>
-            <w:tcW w:type="dxa" w:w="1701"/>
-            <w:tcMar>
-              <w:top w:w="100" w:type="dxa"/>
-              <w:bottom w:w="100" w:type="dxa"/>
-              <w:left w:w="150" w:type="dxa"/>
-              <w:right w:w="150" w:type="dxa"/>
-            </w:tcMar>
-            <w:vAlign w:val="center"/>
-          </w:tcPr>
-          <w:p>
-            <w:pPr>
-              <w:jc w:val="left"/>
-            </w:pPr>
-            <w:r>
-              <w:rPr>
-                <w:sz w:val="20"/>
-              </w:rPr>
-              <w:t>Pretrained + Enrichment</w:t>
-            </w:r>
-          </w:p>
-        </w:tc>
-        <w:tc>
-          <w:tcPr>
-            <w:tcW w:type="dxa" w:w="1701"/>
-            <w:tcMar>
-              <w:top w:w="100" w:type="dxa"/>
-              <w:bottom w:w="100" w:type="dxa"/>
-              <w:left w:w="150" w:type="dxa"/>
-              <w:right w:w="150" w:type="dxa"/>
-            </w:tcMar>
-            <w:vAlign w:val="center"/>
-          </w:tcPr>
-          <w:p>
-            <w:pPr>
-              <w:jc w:val="left"/>
-            </w:pPr>
-            <w:r>
-              <w:rPr>
-                <w:sz w:val="20"/>
-              </w:rPr>
-              <w:t>39 SV + Người lạ</w:t>
-            </w:r>
-          </w:p>
-        </w:tc>
-        <w:tc>
-          <w:tcPr>
-            <w:tcW w:type="dxa" w:w="3969"/>
-            <w:tcMar>
-              <w:top w:w="100" w:type="dxa"/>
-              <w:bottom w:w="100" w:type="dxa"/>
-              <w:left w:w="150" w:type="dxa"/>
-              <w:right w:w="150" w:type="dxa"/>
-            </w:tcMar>
-            <w:vAlign w:val="center"/>
-          </w:tcPr>
-          <w:p>
-            <w:pPr>
-              <w:jc w:val="center"/>
-            </w:pPr>
-            <w:r>
-              <w:rPr>
-                <w:sz w:val="20"/>
-              </w:rPr>
-              <w:t>Chứng minh hiệu quả của cơ chế tự động làm giàu Gallery để thích ứng ngoại hình và tính an toàn chống trôi đặc trưng.</w:t>
-            </w:r>
-          </w:p>
-        </w:tc>
-        <w:tc>
-          <w:tcPr>
-            <w:tcW w:type="dxa" w:w="1701"/>
-            <w:tcMar>
-              <w:top w:w="100" w:type="dxa"/>
-              <w:bottom w:w="100" w:type="dxa"/>
-              <w:left w:w="150" w:type="dxa"/>
-              <w:right w:w="150" w:type="dxa"/>
-            </w:tcMar>
-            <w:vAlign w:val="center"/>
-          </w:tcPr>
-          <w:p>
-            <w:pPr>
-              <w:jc w:val="center"/>
-            </w:pPr>
-            <w:r>
-              <w:rPr>
-                <w:sz w:val="20"/>
-              </w:rPr>
-              <w:t>FAISS Flat</w:t>
+              <w:t>Càng thấp càng tốt</w:t>
             </w:r>
           </w:p>
         </w:tc>
@@ -1785,7 +1012,7 @@
         <w:pStyle w:val="Heading2"/>
       </w:pPr>
       <w:r>
-        <w:t>4.3.2. Đánh giá tính tổng quát hóa đặc trưng: Tinh chỉnh vs. Tiền huấn luyện (Case 1 &amp; 2)</w:t>
+        <w:t>4.3.2. Case 1: Đánh giá hiệu năng mô hình tinh chỉnh (Fine-tune ResNet-18)</w:t>
       </w:r>
     </w:p>
     <w:p>
@@ -1793,7 +1020,7 @@
         <w:spacing w:after="120" w:line="276" w:lineRule="auto"/>
       </w:pPr>
       <w:r>
-        <w:t>Thử nghiệm này kiểm chứng hiện tượng trôi lệch covariate (Covariate Shift). Khi tinh chỉnh một mô hình dung lượng nhỏ (ResNet-18) trên một tập dữ liệu ít mẫu (39 sinh viên), mô hình rất dễ rơi vào quá khớp trên tập đăng ký gốc (ảnh thẻ tiêu chuẩn, studio) và mất khả năng tổng quát hóa trên ảnh webcam thực tế lớp học (nhiễu cảm biến, ánh sáng biến động, góc nghiêng tự nhiên).</w:t>
+        <w:t>Ở thử nghiệm này, chúng tôi huấn luyện lại mô hình học sâu (ResNet-18) trên tập dữ liệu của 39 sinh viên (mỗi sinh viên chỉ có 1 ảnh gốc và được tạo thêm các ảnh biến thể để học). Mục tiêu là kiểm tra xem mô hình tự huấn luyện trên dữ liệu ít này có hoạt động tốt khi đưa vào lớp học thực tế hay không.</w:t>
       </w:r>
     </w:p>
     <w:tbl>
@@ -1864,7 +1091,7 @@
                 <w:color w:val="FFFFFF"/>
                 <w:sz w:val="20"/>
               </w:rPr>
-              <w:t>Thuật toán</w:t>
+              <w:t>Thuật toán so khớp</w:t>
             </w:r>
           </w:p>
         </w:tc>
@@ -1994,7 +1221,7 @@
                 <w:color w:val="FFFFFF"/>
                 <w:sz w:val="20"/>
               </w:rPr>
-              <w:t>Sim TB</w:t>
+              <w:t>Similarity TB</w:t>
             </w:r>
           </w:p>
         </w:tc>
@@ -2020,7 +1247,7 @@
                 <w:color w:val="FFFFFF"/>
                 <w:sz w:val="20"/>
               </w:rPr>
-              <w:t>Unk.Rej.</w:t>
+              <w:t>Unknown Rejection</w:t>
             </w:r>
           </w:p>
         </w:tc>
@@ -2094,7 +1321,7 @@
               <w:rPr>
                 <w:sz w:val="20"/>
               </w:rPr>
-              <w:t>FAISS Flat (Fine-tune)</w:t>
+              <w:t>FAISS Flat</w:t>
             </w:r>
           </w:p>
         </w:tc>
@@ -2303,7 +1530,7 @@
               <w:rPr>
                 <w:sz w:val="20"/>
               </w:rPr>
-              <w:t>FAISS HNSW (Fine-tune)</w:t>
+              <w:t>FAISS HNSW</w:t>
             </w:r>
           </w:p>
         </w:tc>
@@ -2469,6 +1696,291 @@
           </w:p>
         </w:tc>
       </w:tr>
+    </w:tbl>
+    <w:p>
+      <w:pPr>
+        <w:spacing w:after="120"/>
+      </w:pPr>
+    </w:p>
+    <w:p>
+      <w:pPr>
+        <w:spacing w:after="120" w:line="276" w:lineRule="auto"/>
+      </w:pPr>
+      <w:r>
+        <w:t>Giải thích kết quả dễ hiểu: Độ chính xác của mô hình tự huấn luyện (Fine-tune) rất thấp, chỉ đạt 20.69% (tức là 10 lần điểm danh thì chỉ đúng khoảng 2 lần). Nguyên nhân là do mỗi sinh viên chỉ có 1 ảnh đăng ký ban đầu, khiến mô hình bị học vẹt (quá khớp). Nó chỉ nhận ra sinh viên khi đứng thẳng, đủ sáng giống hệt ảnh đăng ký. Khi áp dụng vào lớp học thực tế với camera mờ, ánh sáng thay đổi hoặc sinh viên hơi nghiêng đầu, mô hình hoàn toàn không nhận diện được. Kết luận là việc tự huấn luyện lại mô hình nhỏ trên dữ liệu ít là không khả thi.</w:t>
+      </w:r>
+    </w:p>
+    <w:p>
+      <w:pPr>
+        <w:pStyle w:val="Heading2"/>
+      </w:pPr>
+      <w:r>
+        <w:t>4.3.3. Case 2: Đánh giá hiệu năng mô hình tiền huấn luyện (ArcFace Pretrained)</w:t>
+      </w:r>
+    </w:p>
+    <w:p>
+      <w:pPr>
+        <w:spacing w:after="120" w:line="276" w:lineRule="auto"/>
+      </w:pPr>
+      <w:r>
+        <w:t>Thử nghiệm này sử dụng trực tiếp mô hình ArcFace ResNet-50 đã được các chuyên gia huấn luyện sẵn trên hàng triệu khuôn mặt trước đó. Hệ thống rút trích đặc trưng của ảnh đăng ký gốc và so khớp trực tiếp với ảnh webcam phòng học thật của 39 sinh viên.</w:t>
+      </w:r>
+    </w:p>
+    <w:tbl>
+      <w:tblPr>
+        <w:tblStyle w:val="TableGrid"/>
+        <w:tblW w:type="auto" w:w="0"/>
+        <w:jc w:val="center"/>
+        <w:tblLayout w:type="fixed"/>
+        <w:tblLook w:firstColumn="1" w:firstRow="1" w:lastColumn="0" w:lastRow="0" w:noHBand="0" w:noVBand="1" w:val="04A0"/>
+      </w:tblPr>
+      <w:tblGrid>
+        <w:gridCol w:w="1045"/>
+        <w:gridCol w:w="1045"/>
+        <w:gridCol w:w="1045"/>
+        <w:gridCol w:w="1045"/>
+        <w:gridCol w:w="1045"/>
+        <w:gridCol w:w="1045"/>
+        <w:gridCol w:w="1045"/>
+        <w:gridCol w:w="1045"/>
+        <w:gridCol w:w="1045"/>
+      </w:tblGrid>
+      <w:tr>
+        <w:tc>
+          <w:tcPr>
+            <w:tcW w:type="dxa" w:w="567"/>
+            <w:shd w:fill="1F4E79"/>
+            <w:tcMar>
+              <w:top w:w="120" w:type="dxa"/>
+              <w:bottom w:w="120" w:type="dxa"/>
+              <w:left w:w="150" w:type="dxa"/>
+              <w:right w:w="150" w:type="dxa"/>
+            </w:tcMar>
+            <w:vAlign w:val="center"/>
+          </w:tcPr>
+          <w:p>
+            <w:pPr>
+              <w:jc w:val="center"/>
+            </w:pPr>
+            <w:r>
+              <w:rPr>
+                <w:b/>
+                <w:color w:val="FFFFFF"/>
+                <w:sz w:val="20"/>
+              </w:rPr>
+              <w:t>STT</w:t>
+            </w:r>
+          </w:p>
+        </w:tc>
+        <w:tc>
+          <w:tcPr>
+            <w:tcW w:type="dxa" w:w="1984"/>
+            <w:shd w:fill="1F4E79"/>
+            <w:tcMar>
+              <w:top w:w="120" w:type="dxa"/>
+              <w:bottom w:w="120" w:type="dxa"/>
+              <w:left w:w="150" w:type="dxa"/>
+              <w:right w:w="150" w:type="dxa"/>
+            </w:tcMar>
+            <w:vAlign w:val="center"/>
+          </w:tcPr>
+          <w:p>
+            <w:pPr>
+              <w:jc w:val="center"/>
+            </w:pPr>
+            <w:r>
+              <w:rPr>
+                <w:b/>
+                <w:color w:val="FFFFFF"/>
+                <w:sz w:val="20"/>
+              </w:rPr>
+              <w:t>Thuật toán so khớp</w:t>
+            </w:r>
+          </w:p>
+        </w:tc>
+        <w:tc>
+          <w:tcPr>
+            <w:tcW w:type="dxa" w:w="1134"/>
+            <w:shd w:fill="1F4E79"/>
+            <w:tcMar>
+              <w:top w:w="120" w:type="dxa"/>
+              <w:bottom w:w="120" w:type="dxa"/>
+              <w:left w:w="150" w:type="dxa"/>
+              <w:right w:w="150" w:type="dxa"/>
+            </w:tcMar>
+            <w:vAlign w:val="center"/>
+          </w:tcPr>
+          <w:p>
+            <w:pPr>
+              <w:jc w:val="center"/>
+            </w:pPr>
+            <w:r>
+              <w:rPr>
+                <w:b/>
+                <w:color w:val="FFFFFF"/>
+                <w:sz w:val="20"/>
+              </w:rPr>
+              <w:t>Accuracy</w:t>
+            </w:r>
+          </w:p>
+        </w:tc>
+        <w:tc>
+          <w:tcPr>
+            <w:tcW w:type="dxa" w:w="1134"/>
+            <w:shd w:fill="1F4E79"/>
+            <w:tcMar>
+              <w:top w:w="120" w:type="dxa"/>
+              <w:bottom w:w="120" w:type="dxa"/>
+              <w:left w:w="150" w:type="dxa"/>
+              <w:right w:w="150" w:type="dxa"/>
+            </w:tcMar>
+            <w:vAlign w:val="center"/>
+          </w:tcPr>
+          <w:p>
+            <w:pPr>
+              <w:jc w:val="center"/>
+            </w:pPr>
+            <w:r>
+              <w:rPr>
+                <w:b/>
+                <w:color w:val="FFFFFF"/>
+                <w:sz w:val="20"/>
+              </w:rPr>
+              <w:t>Precision</w:t>
+            </w:r>
+          </w:p>
+        </w:tc>
+        <w:tc>
+          <w:tcPr>
+            <w:tcW w:type="dxa" w:w="1134"/>
+            <w:shd w:fill="1F4E79"/>
+            <w:tcMar>
+              <w:top w:w="120" w:type="dxa"/>
+              <w:bottom w:w="120" w:type="dxa"/>
+              <w:left w:w="150" w:type="dxa"/>
+              <w:right w:w="150" w:type="dxa"/>
+            </w:tcMar>
+            <w:vAlign w:val="center"/>
+          </w:tcPr>
+          <w:p>
+            <w:pPr>
+              <w:jc w:val="center"/>
+            </w:pPr>
+            <w:r>
+              <w:rPr>
+                <w:b/>
+                <w:color w:val="FFFFFF"/>
+                <w:sz w:val="20"/>
+              </w:rPr>
+              <w:t>Recall</w:t>
+            </w:r>
+          </w:p>
+        </w:tc>
+        <w:tc>
+          <w:tcPr>
+            <w:tcW w:type="dxa" w:w="1134"/>
+            <w:shd w:fill="1F4E79"/>
+            <w:tcMar>
+              <w:top w:w="120" w:type="dxa"/>
+              <w:bottom w:w="120" w:type="dxa"/>
+              <w:left w:w="150" w:type="dxa"/>
+              <w:right w:w="150" w:type="dxa"/>
+            </w:tcMar>
+            <w:vAlign w:val="center"/>
+          </w:tcPr>
+          <w:p>
+            <w:pPr>
+              <w:jc w:val="center"/>
+            </w:pPr>
+            <w:r>
+              <w:rPr>
+                <w:b/>
+                <w:color w:val="FFFFFF"/>
+                <w:sz w:val="20"/>
+              </w:rPr>
+              <w:t>F1-Score</w:t>
+            </w:r>
+          </w:p>
+        </w:tc>
+        <w:tc>
+          <w:tcPr>
+            <w:tcW w:type="dxa" w:w="1020"/>
+            <w:shd w:fill="1F4E79"/>
+            <w:tcMar>
+              <w:top w:w="120" w:type="dxa"/>
+              <w:bottom w:w="120" w:type="dxa"/>
+              <w:left w:w="150" w:type="dxa"/>
+              <w:right w:w="150" w:type="dxa"/>
+            </w:tcMar>
+            <w:vAlign w:val="center"/>
+          </w:tcPr>
+          <w:p>
+            <w:pPr>
+              <w:jc w:val="center"/>
+            </w:pPr>
+            <w:r>
+              <w:rPr>
+                <w:b/>
+                <w:color w:val="FFFFFF"/>
+                <w:sz w:val="20"/>
+              </w:rPr>
+              <w:t>Similarity TB</w:t>
+            </w:r>
+          </w:p>
+        </w:tc>
+        <w:tc>
+          <w:tcPr>
+            <w:tcW w:type="dxa" w:w="1020"/>
+            <w:shd w:fill="1F4E79"/>
+            <w:tcMar>
+              <w:top w:w="120" w:type="dxa"/>
+              <w:bottom w:w="120" w:type="dxa"/>
+              <w:left w:w="150" w:type="dxa"/>
+              <w:right w:w="150" w:type="dxa"/>
+            </w:tcMar>
+            <w:vAlign w:val="center"/>
+          </w:tcPr>
+          <w:p>
+            <w:pPr>
+              <w:jc w:val="center"/>
+            </w:pPr>
+            <w:r>
+              <w:rPr>
+                <w:b/>
+                <w:color w:val="FFFFFF"/>
+                <w:sz w:val="20"/>
+              </w:rPr>
+              <w:t>Unknown Rejection</w:t>
+            </w:r>
+          </w:p>
+        </w:tc>
+        <w:tc>
+          <w:tcPr>
+            <w:tcW w:type="dxa" w:w="1417"/>
+            <w:shd w:fill="1F4E79"/>
+            <w:tcMar>
+              <w:top w:w="120" w:type="dxa"/>
+              <w:bottom w:w="120" w:type="dxa"/>
+              <w:left w:w="150" w:type="dxa"/>
+              <w:right w:w="150" w:type="dxa"/>
+            </w:tcMar>
+            <w:vAlign w:val="center"/>
+          </w:tcPr>
+          <w:p>
+            <w:pPr>
+              <w:jc w:val="center"/>
+            </w:pPr>
+            <w:r>
+              <w:rPr>
+                <w:b/>
+                <w:color w:val="FFFFFF"/>
+                <w:sz w:val="20"/>
+              </w:rPr>
+              <w:t>Latency Head</w:t>
+            </w:r>
+          </w:p>
+        </w:tc>
+      </w:tr>
       <w:tr>
         <w:tc>
           <w:tcPr>
@@ -2489,7 +2001,7 @@
               <w:rPr>
                 <w:sz w:val="20"/>
               </w:rPr>
-              <w:t>3</w:t>
+              <w:t>1</w:t>
             </w:r>
           </w:p>
         </w:tc>
@@ -2512,7 +2024,7 @@
               <w:rPr>
                 <w:sz w:val="20"/>
               </w:rPr>
-              <w:t>FAISS Flat (Pretrained)</w:t>
+              <w:t>FAISS Flat</w:t>
             </w:r>
           </w:p>
         </w:tc>
@@ -2698,7 +2210,7 @@
               <w:rPr>
                 <w:sz w:val="20"/>
               </w:rPr>
-              <w:t>4</w:t>
+              <w:t>2</w:t>
             </w:r>
           </w:p>
         </w:tc>
@@ -2721,7 +2233,7 @@
               <w:rPr>
                 <w:sz w:val="20"/>
               </w:rPr>
-              <w:t>FAISS HNSW (Pretrained)</w:t>
+              <w:t>FAISS HNSW</w:t>
             </w:r>
           </w:p>
         </w:tc>
@@ -2898,7 +2410,7 @@
         <w:spacing w:after="120" w:line="276" w:lineRule="auto"/>
       </w:pPr>
       <w:r>
-        <w:t>Phân tích học thuật: Dựa trên kết quả thực nghiệm, mô hình Tinh chỉnh ResNet-18 đạt độ chính xác cực kỳ thấp (~20.69%). Nguyên nhân là do việc huấn luyện lại mạng nơ-ron từ đầu trên tập mẫu siêu nhỏ (Few-shot) mà không có dữ liệu nền đủ lớn làm biến dạng không gian biểu diễn đặc trưng khuôn mặt khi môi trường thực tế thay đổi. Trong khi đó, ArcFace Pretrained ResNet-50 đạt hiệu năng tuyệt đối 100.00% nhờ không gian vector đặc trưng có biên độ góc lớn (Additive Angular Margin), giúp tách biệt rõ ràng và chống chịu tốt trước mọi nhiễu ngoại cảnh.</w:t>
+        <w:t>Giải thích kết quả dễ hiểu: Mô hình dùng sẵn (Pretrained ArcFace) đạt độ chính xác tuyệt đối 100% trên tất cả các chỉ số (toàn bộ sinh viên đi học đều được điểm danh đúng). Sở dĩ mô hình này thông minh vượt trội là vì nó đã được học trước từ hàng triệu khuôn mặt khác nhau. Nhờ đó, nó tự rút ra được các đặc điểm cốt lõi trên khuôn mặt người (như khoảng cách mắt, mũi, miệng) mà không bị ảnh hưởng bởi môi trường. Dù ánh sáng lớp học có thay đổi hay sinh viên quay các góc mặt khác nhau, mô hình vẫn nhận diện chính xác.</w:t>
       </w:r>
     </w:p>
     <w:p>
@@ -2906,7 +2418,7 @@
         <w:pStyle w:val="Heading2"/>
       </w:pPr>
       <w:r>
-        <w:t>4.3.3. Khảo sát khả năng mở rộng quy mô và độ trễ tìm kiếm (Case 3 - Scalability)</w:t>
+        <w:t>4.3.4. Case 3: Thử nghiệm khả năng chịu tải và độ trễ ở quy mô lớn (N = 16.000)</w:t>
       </w:r>
     </w:p>
     <w:p>
@@ -2914,7 +2426,7 @@
         <w:spacing w:after="120" w:line="276" w:lineRule="auto"/>
       </w:pPr>
       <w:r>
-        <w:t>Độ trễ tìm kiếm của thuật toán so khớp quyết định trực tiếp khả năng chịu tải thời gian thực của ứng dụng khi triển khai diện rộng. Thực nghiệm tiến hành khảo sát xu hướng thay đổi độ trễ của FAISS Flat (tìm kiếm tuyến tính O(N)) và FAISS HNSW (tìm kiếm đồ thị O(log N)):</w:t>
+        <w:t>Khi số lượng sinh viên tăng lên hàng nghìn người, tốc độ tìm kiếm là yếu tố cực kỳ quan trọng để camera không bị giật lag. Chúng tôi thử nghiệm đo độ trễ tìm kiếm của thuật toán Flat (dò tìm tuần tự toàn bộ) và HNSW (dò tìm phân cấp thông minh) ở các quy mô từ 500 đến 16.000 sinh viên:</w:t>
       </w:r>
     </w:p>
     <w:tbl>
@@ -3007,7 +2519,7 @@
                 <w:color w:val="FFFFFF"/>
                 <w:sz w:val="20"/>
               </w:rPr>
-              <w:t>Độ trễ Cực tiểu (Min)</w:t>
+              <w:t>Độ trễ tối thiểu (Min)</w:t>
             </w:r>
           </w:p>
         </w:tc>
@@ -3033,7 +2545,7 @@
                 <w:color w:val="FFFFFF"/>
                 <w:sz w:val="20"/>
               </w:rPr>
-              <w:t>Độ trễ Cực đại (Max)</w:t>
+              <w:t>Độ trễ tối đa (Max)</w:t>
             </w:r>
           </w:p>
         </w:tc>
@@ -3059,7 +2571,7 @@
                 <w:color w:val="FFFFFF"/>
                 <w:sz w:val="20"/>
               </w:rPr>
-              <w:t>Độ trễ Trung bình (Mean)</w:t>
+              <w:t>Độ trễ trung bình (Mean)</w:t>
             </w:r>
           </w:p>
         </w:tc>
@@ -3201,7 +2713,7 @@
               <w:rPr>
                 <w:sz w:val="20"/>
               </w:rPr>
-              <w:t>(8.500 vectors)</w:t>
+              <w:t>(8.500 ảnh)</w:t>
             </w:r>
           </w:p>
         </w:tc>
@@ -3435,7 +2947,7 @@
               <w:rPr>
                 <w:sz w:val="20"/>
               </w:rPr>
-              <w:t>(17.000 vectors)</w:t>
+              <w:t>(17.000 ảnh)</w:t>
             </w:r>
           </w:p>
         </w:tc>
@@ -3669,7 +3181,7 @@
               <w:rPr>
                 <w:sz w:val="20"/>
               </w:rPr>
-              <w:t>(85.000 vectors)</w:t>
+              <w:t>(85.000 ảnh)</w:t>
             </w:r>
           </w:p>
         </w:tc>
@@ -3903,7 +3415,7 @@
               <w:rPr>
                 <w:sz w:val="20"/>
               </w:rPr>
-              <w:t>(272.000 vectors)</w:t>
+              <w:t>(272.000 ảnh)</w:t>
             </w:r>
           </w:p>
         </w:tc>
@@ -4011,7 +3523,11 @@
         <w:spacing w:after="120" w:line="276" w:lineRule="auto"/>
       </w:pPr>
       <w:r>
-        <w:t>Phân tích học thuật: Khi quy mô nhỏ (N &lt;= 1.000), FAISS Flat hoạt động tốt hơn nhẹ do không chịu chi phí phụ khi duyệt đồ thị. Tuy nhiên, khi mở rộng quy mô lên N = 16.000 (272.000 vector đặc trưng), FAISS HNSW chứng minh hiệu quả vượt trội khi giữ độ trễ trung bình chỉ ở mức 0.0321 ms (nhanh hơn Flat 1.62 lần) và độ trễ cực đại chỉ 0.1190 ms (ổn định hơn Flat 3.22 lần). HNSW là giải pháp cần thiết khi triển khai quy mô lớn.</w:t>
+        <w:t>Giải thích kết quả dễ hiểu: Tốc độ tìm kiếm khuôn mặt phụ thuộc rất lớn vào cách tìm kiếm trong bộ nhớ:</w:t>
+        <w:br/>
+        <w:t>- Thuật toán Flat giống như việc ta đi dò tên từng người một từ đầu đến cuối danh sách. Khi lớp học chỉ có dưới 1.000 sinh viên, cách này vẫn chạy rất nhanh. Nhưng khi trường học có tới 16.000 sinh viên (tương đương 272.000 ảnh đặc trưng), việc dò từng người sẽ rất tốn thời gian, gây lag camera.</w:t>
+        <w:br/>
+        <w:t>- Thuật toán HNSW giống như một cuốn danh bạ thông minh được chia theo mục lục phân cấp. Thay vì dò hết, HNSW nhảy nhanh qua các nhóm khuôn mặt tương tự để tìm ra kết quả gần đúng nhất. Kết quả cho thấy ở quy mô 16.000 sinh viên, HNSW chỉ mất 0.0321 mili-giây để tìm ra khuôn mặt (nhanh hơn Flat 1.6 lần) và độ trễ tối đa cực kỳ thấp (0.1190 mili-giây). Do đó, HNSW là lựa chọn bắt buộc khi triển khai quy mô lớn để hệ thống chạy mượt mà.</w:t>
       </w:r>
     </w:p>
     <w:p>
@@ -4019,7 +3535,7 @@
         <w:pStyle w:val="Heading2"/>
       </w:pPr>
       <w:r>
-        <w:t>4.3.4. Đánh giá tính an toàn bảo mật và lọc người lạ (Case 4 - Unknown Rejection)</w:t>
+        <w:t>4.3.5. Case 4: Đánh giá khả năng phát hiện người lạ (Unknown Rejection)</w:t>
       </w:r>
     </w:p>
     <w:p>
@@ -4027,7 +3543,7 @@
         <w:spacing w:after="120" w:line="276" w:lineRule="auto"/>
       </w:pPr>
       <w:r>
-        <w:t>Hệ thống thiết lập ngưỡng an toàn tối thiểu T = 0.45 nhằm từ chối các đối tượng giả mạo hoặc người ngoài không thuộc hệ thống (Impostor Probes). Thử nghiệm tiến hành so khớp 85 ảnh người lạ thật thu thập từ internet với cơ sở dữ liệu:</w:t>
+        <w:t>Hệ thống sử dụng ngưỡng so khớp T = 0.45 làm mốc để nhận diện sinh viên. Nếu điểm tương đồng khuôn mặt nhỏ hơn 0.45, hệ thống sẽ coi là người ngoài lớp học và báo đỏ. Chúng tôi cho 85 ảnh người lạ đi qua camera để kiểm tra độ an toàn của ngưỡng quyết định này:</w:t>
       </w:r>
     </w:p>
     <w:tbl>
@@ -4714,7 +4230,7 @@
         <w:spacing w:after="120" w:line="276" w:lineRule="auto"/>
       </w:pPr>
       <w:r>
-        <w:t>Phân tích học thuật: Cả hai thuật toán đều đạt tỷ lệ lọc chính xác tuyệt đối 100.00%. Điểm tương đồng trung bình của người lạ rất thấp (0.1719), cách xa ngưỡng quyết định T = 0.45. Điều này chứng minh không gian đặc trưng ArcFace phân tách người lạ rất tốt, mang lại tính bảo mật cao.</w:t>
+        <w:t>Giải thích kết quả dễ hiểu: Hệ thống đạt tỷ lệ lọc người lạ hoàn hảo 100.00%. Điểm tương đồng trung bình của người lạ rất thấp, chỉ đạt 0.1719, nằm dưới rất sâu so với ngưỡng quyết định 0.45. Điều này chứng minh hệ thống hoạt động vô cùng an toàn, tránh tối đa việc nhận diện nhầm người lạ hoặc điểm danh hộ cho người ngoài lớp học.</w:t>
       </w:r>
     </w:p>
     <w:p>
@@ -4722,7 +4238,7 @@
         <w:pStyle w:val="Heading2"/>
       </w:pPr>
       <w:r>
-        <w:t>4.3.5. Đánh giá cơ chế tự thích ứng: Tối ưu hóa Gallery (Case 5 - Gallery Enrichment)</w:t>
+        <w:t>4.3.6. Case 5: Đánh giá cơ chế tự động tối ưu hóa ảnh mẫu (Progressive Gallery Enrichment)</w:t>
       </w:r>
     </w:p>
     <w:p>
@@ -4730,7 +4246,7 @@
         <w:spacing w:after="120" w:line="276" w:lineRule="auto"/>
       </w:pPr>
       <w:r>
-        <w:t>Cơ chế Progressive Gallery Enrichment tự động làm giàu thư viện đặc trưng khi ứng dụng vận hành. Để tránh hiện tượng trôi lệch ngữ nghĩa (Gallery Drift), hệ thống áp dụng ngưỡng làm giàu cao (&gt;= 0.75), khống chế tỷ lệ ảnh enriched/total và giữ ảnh thẻ gốc làm neo chính.</w:t>
+        <w:t>Progressive Gallery Enrichment là tính năng tự động lưu thêm ảnh thực tế của sinh viên khi họ điểm danh thành công với độ tin cậy cao (Similarity &gt;= 0.75). Hệ thống áp dụng các bộ lọc bảo vệ nghiêm ngặt: chỉ lưu khi hệ thống cực kỳ tự tin (&gt;=0.75), giới hạn số ảnh phụ được lưu, và giữ ảnh thẻ gốc làm neo chính để cơ sở dữ liệu không bao giờ bị lệch hướng (Gallery Drift).</w:t>
       </w:r>
     </w:p>
     <w:p>
@@ -4738,7 +4254,7 @@
         <w:spacing w:after="120" w:line="276" w:lineRule="auto"/>
       </w:pPr>
       <w:r>
-        <w:t>Thiết kế kiểm chứng: chia nhỏ ảnh thực tế của từng sinh viên làm hai phần (ảnh 1-3 để enrich; ảnh 4-5 để test sự kiện mới) và đối chiếu:</w:t>
+        <w:t>Chúng tôi chia nhỏ dữ liệu thực tế (ảnh 1-3 để hệ thống tự động lưu mẫu phụ; ảnh 4-5 làm ảnh mới điểm danh) để đối chiếu hiệu quả:</w:t>
       </w:r>
     </w:p>
     <w:tbl>
@@ -4809,7 +4325,7 @@
                 <w:color w:val="FFFFFF"/>
                 <w:sz w:val="20"/>
               </w:rPr>
-              <w:t>Trạng thái Gallery thử nghiệm</w:t>
+              <w:t>Trạng thái thư viện ảnh</w:t>
             </w:r>
           </w:p>
         </w:tc>
@@ -5039,7 +4555,7 @@
               <w:rPr>
                 <w:sz w:val="20"/>
               </w:rPr>
-              <w:t>Không enrich (Baseline)</w:t>
+              <w:t>Không cập nhật (Chỉ có ảnh thẻ)</w:t>
             </w:r>
           </w:p>
         </w:tc>
@@ -5248,7 +4764,7 @@
               <w:rPr>
                 <w:sz w:val="20"/>
               </w:rPr>
-              <w:t>Có enrich (Làm giàu từ ảnh 1-3)</w:t>
+              <w:t>Có cập nhật (Có ảnh phụ 1-3)</w:t>
             </w:r>
           </w:p>
         </w:tc>
@@ -5457,7 +4973,7 @@
               <w:rPr>
                 <w:sz w:val="20"/>
               </w:rPr>
-              <w:t>Có enrich + Người lạ (Lọc người ngoài)</w:t>
+              <w:t>Có cập nhật + Người lạ (Lọc người ngoài)</w:t>
             </w:r>
           </w:p>
         </w:tc>
@@ -5634,7 +5150,7 @@
         <w:spacing w:after="120" w:line="276" w:lineRule="auto"/>
       </w:pPr>
       <w:r>
-        <w:t>Phân tích học thuật: Việc tự động làm giàu đặc trưng giúp Similarity trung bình tăng mạnh từ 0.5782 lên 0.7771 (tăng +19.89%), giúp hệ thống nhận diện nhạy hơn và ổn định hơn trước biến động ngoại hình. Đồng thời, tỷ lệ từ chối người lạ vẫn được duy trì ở mức tuyệt đối 100.00% với Similarity trung bình của người lạ thấp (0.1938), xác nhận tính an toàn tuyệt đối của cơ chế bảo vệ.</w:t>
+        <w:t>Giải thích kết quả dễ hiểu: Khi bật tính năng tự động cập nhật ảnh mẫu, độ tương đồng trung bình khi nhận diện sinh viên tăng vọt từ 0.5782 lên 0.7771 (tăng +19.89%). Điều này giúp hệ thống 'quen mặt' sinh viên hơn sau mỗi buổi đi học, giúp những lần điểm danh tiếp theo diễn ra nhanh nhạy hơn, dễ dàng vượt qua các biến đổi về ánh sáng hoặc góc nghiêng. Đồng thời, tỷ lệ từ chối người ngoài vẫn giữ vững ở mức tuyệt đối 100.00% với Similarity trung bình của người lạ thấp (0.1938), chứng minh cơ chế tự động cập nhật này hoạt động vô cùng an toàn và không gây lỗi nhầm lẫn.</w:t>
       </w:r>
     </w:p>
     <w:sectPr>

</xml_diff>